<commit_message>
Integrate trained bilingual mBERT and verified encoder comparisons
</commit_message>
<xml_diff>
--- a/outputs/CodeMood_Hindi_English_Project_Progress_Report.docx
+++ b/outputs/CodeMood_Hindi_English_Project_Progress_Report.docx
@@ -62,7 +62,7 @@
     </w:p>
     <w:p>
       <w:r>
-        <w:t>This report explains the implemented pipeline, completed XLM-R and MuRIL experiments, the mBERT training handoff and the human review workflow. It separates measured results from the work that still requires training or independent evaluation.</w:t>
+        <w:t>This report explains the implemented pipeline, completed XLM-R and MuRIL experiments, the completed mBERT experiment and the human review workflow. It separates measured results from the work that still requires training or independent evaluation.</w:t>
       </w:r>
     </w:p>
     <w:p>
@@ -124,7 +124,7 @@
         <w:pStyle w:val="Caption"/>
       </w:pPr>
       <w:r>
-        <w:t>Figure 1. Complete CodeMood workflow. The outputs are independent workspace actions. Dashed routes indicate optional review or a future, explicitly approved retraining step. MuRIL is limited to Hindi-English; mBERT weights await the Colab run.</w:t>
+        <w:t>Figure 1. Complete CodeMood workflow. The outputs are independent workspace actions. Dashed routes indicate optional review or a future, explicitly approved retraining step. MuRIL is limited to Hindi-English; XLM-R and mBERT support both language mixes.</w:t>
       </w:r>
     </w:p>
     <w:p>
@@ -166,7 +166,7 @@
     </w:p>
     <w:p>
       <w:r>
-        <w:t>The contribution is an integrated local research workflow with task separation, language and provenance warnings, data guards, artifact export/import and human review controls. Real-world validity, learned sarcasm, learned emoji fusion, calibrated confidence, measured Qwen benefit and a completed mBERT emotion run remain open work.</w:t>
+        <w:t>The contribution is an integrated local research workflow with task separation, language and provenance warnings, data guards, artifact export/import and human review controls. Real-world validity, learned sarcasm, learned emoji fusion, calibrated confidence and measured Qwen benefit remain open work. The bilingual mBERT run is now complete and installed.</w:t>
       </w:r>
     </w:p>
     <w:p>
@@ -1442,7 +1442,7 @@
                 <w:color w:val="202830"/>
                 <w:sz w:val="19"/>
               </w:rPr>
-              <w:t>Packaging, recovery and export</w:t>
+              <w:t>XLM-R, MuRIL and mBERT exports installed</w:t>
             </w:r>
           </w:p>
         </w:tc>
@@ -1474,7 +1474,7 @@
                 <w:color w:val="202830"/>
                 <w:sz w:val="19"/>
               </w:rPr>
-              <w:t>mBERT result pending</w:t>
+              <w:t>Independent human evaluation remains pending</w:t>
             </w:r>
           </w:p>
         </w:tc>
@@ -1693,7 +1693,7 @@
     </w:p>
     <w:p>
       <w:r>
-        <w:t>MuRIL uses synthetic hi-en 8,000/1,000/1,000. It shares test identities with combined XLM-R’s hi-en slice, but combined XLM-R trained on both language pairs while MuRIL trained on hi-en only. This is not a controlled encoder comparison. Matched experiments must align rows, preprocessing and budget. The mBERT Colab package is ready and checks the same 16,000/2,000/2,000 data and split contract as combined XLM-R. Training and results are pending; no score is assigned.</w:t>
+        <w:t>MuRIL uses synthetic hi-en 8,000/1,000/1,000. It shares test identities with combined XLM-R’s hi-en slice, but combined XLM-R trained on both language pairs while MuRIL trained on hi-en only. This is not a controlled encoder comparison. Matched experiments must align rows, preprocessing and budget. The completed mBERT run uses the same 16,000/2,000/2,000 data and split contract as combined XLM-R. It selected epoch 1 by validation macro-F1 and reports 81.4% accuracy with 0.8119 macro-F1 on 2,000 synthetic test phrases. CPU inference from the downloaded weights reproduced these metrics exactly. Hindi-English accuracy is 84.3% with macro-F1 0.8439; English-French accuracy is 78.5% with macro-F1 0.7708.</w:t>
       </w:r>
     </w:p>
     <w:p>
@@ -1869,7 +1869,7 @@
     </w:p>
     <w:p>
       <w:r>
-        <w:t>A separate evaluation_set folder now contains 100 Hindi-English and 100 English-French challenge phrases, plus unlabelled prediction copies. Their proposed labels are explicitly assistant-authored drafts and human_reviewed is false. The overlap audit found zero normalized exact matches against all 20,000 frozen source rows and the three installed model guards. This rules out those particular duplicates, not semantic overlap or annotation error. These files are for inspection and subsequent independent annotation; they are not a new human benchmark and must stay outside training.</w:t>
+        <w:t>A separate evaluation_set folder now contains 100 Hindi-English and 100 English-French challenge phrases, plus unlabelled prediction copies. Their proposed labels are explicitly assistant-authored drafts and human_reviewed is false. The overlap audit found zero normalized exact matches against all 20,000 frozen source rows and the four installed model guards. This rules out those particular duplicates, not semantic overlap or annotation error. These files are for inspection and subsequent independent annotation; they are not a new human benchmark and must stay outside training.</w:t>
       </w:r>
     </w:p>
     <w:p>
@@ -2833,7 +2833,7 @@
                 <w:color w:val="202830"/>
                 <w:sz w:val="19"/>
               </w:rPr>
-              <w:t>mBERT</w:t>
+              <w:t>Combined mBERT</w:t>
             </w:r>
           </w:p>
         </w:tc>
@@ -2865,7 +2865,7 @@
                 <w:color w:val="202830"/>
                 <w:sz w:val="19"/>
               </w:rPr>
-              <w:t>Pending</w:t>
+              <w:t>2,000 generated rows</w:t>
             </w:r>
           </w:p>
         </w:tc>
@@ -2897,7 +2897,7 @@
                 <w:color w:val="202830"/>
                 <w:sz w:val="19"/>
               </w:rPr>
-              <w:t>No score</w:t>
+              <w:t>81.4%; macro-F1 0.8119</w:t>
             </w:r>
           </w:p>
         </w:tc>
@@ -2929,7 +2929,273 @@
                 <w:color w:val="202830"/>
                 <w:sz w:val="19"/>
               </w:rPr>
-              <w:t>Package is not a result</w:t>
+              <w:t>Same bilingual partitions; CPU result reproduced</w:t>
+            </w:r>
+          </w:p>
+        </w:tc>
+      </w:tr>
+      <w:tr>
+        <w:trPr>
+          <w:cantSplit/>
+        </w:trPr>
+        <w:tc>
+          <w:tcPr>
+            <w:tcW w:type="dxa" w:w="2304"/>
+            <w:vAlign w:val="center"/>
+            <w:shd w:fill="F2F6F7"/>
+            <w:tcBorders>
+              <w:top w:val="single" w:sz="4" w:color="D9D9D9"/>
+              <w:left w:val="single" w:sz="4" w:color="D9D9D9"/>
+              <w:bottom w:val="single" w:sz="4" w:color="D9D9D9"/>
+              <w:right w:val="single" w:sz="4" w:color="D9D9D9"/>
+            </w:tcBorders>
+            <w:tcMar>
+              <w:top w:w="80" w:type="dxa"/>
+              <w:left w:w="80" w:type="dxa"/>
+              <w:bottom w:w="80" w:type="dxa"/>
+              <w:right w:w="80" w:type="dxa"/>
+            </w:tcMar>
+          </w:tcPr>
+          <w:p>
+            <w:pPr>
+              <w:spacing w:after="80" w:before="80" w:line="252" w:lineRule="auto"/>
+            </w:pPr>
+            <w:r>
+              <w:rPr>
+                <w:b w:val="0"/>
+                <w:color w:val="202830"/>
+                <w:sz w:val="19"/>
+              </w:rPr>
+              <w:t>mBERT hi-en</w:t>
+            </w:r>
+          </w:p>
+        </w:tc>
+        <w:tc>
+          <w:tcPr>
+            <w:tcW w:type="dxa" w:w="2232"/>
+            <w:vAlign w:val="center"/>
+            <w:shd w:fill="F2F6F7"/>
+            <w:tcBorders>
+              <w:top w:val="single" w:sz="4" w:color="D9D9D9"/>
+              <w:left w:val="single" w:sz="4" w:color="D9D9D9"/>
+              <w:bottom w:val="single" w:sz="4" w:color="D9D9D9"/>
+              <w:right w:val="single" w:sz="4" w:color="D9D9D9"/>
+            </w:tcBorders>
+            <w:tcMar>
+              <w:top w:w="80" w:type="dxa"/>
+              <w:left w:w="80" w:type="dxa"/>
+              <w:bottom w:w="80" w:type="dxa"/>
+              <w:right w:w="80" w:type="dxa"/>
+            </w:tcMar>
+          </w:tcPr>
+          <w:p>
+            <w:pPr>
+              <w:spacing w:after="80" w:before="80" w:line="252" w:lineRule="auto"/>
+            </w:pPr>
+            <w:r>
+              <w:rPr>
+                <w:b w:val="0"/>
+                <w:color w:val="202830"/>
+                <w:sz w:val="19"/>
+              </w:rPr>
+              <w:t>1,000 generated</w:t>
+            </w:r>
+          </w:p>
+        </w:tc>
+        <w:tc>
+          <w:tcPr>
+            <w:tcW w:type="dxa" w:w="2952"/>
+            <w:vAlign w:val="center"/>
+            <w:shd w:fill="F2F6F7"/>
+            <w:tcBorders>
+              <w:top w:val="single" w:sz="4" w:color="D9D9D9"/>
+              <w:left w:val="single" w:sz="4" w:color="D9D9D9"/>
+              <w:bottom w:val="single" w:sz="4" w:color="D9D9D9"/>
+              <w:right w:val="single" w:sz="4" w:color="D9D9D9"/>
+            </w:tcBorders>
+            <w:tcMar>
+              <w:top w:w="80" w:type="dxa"/>
+              <w:left w:w="80" w:type="dxa"/>
+              <w:bottom w:w="80" w:type="dxa"/>
+              <w:right w:w="80" w:type="dxa"/>
+            </w:tcMar>
+          </w:tcPr>
+          <w:p>
+            <w:pPr>
+              <w:spacing w:after="80" w:before="80" w:line="252" w:lineRule="auto"/>
+            </w:pPr>
+            <w:r>
+              <w:rPr>
+                <w:b w:val="0"/>
+                <w:color w:val="202830"/>
+                <w:sz w:val="19"/>
+              </w:rPr>
+              <w:t>84.3%; macro-F1 0.8439</w:t>
+            </w:r>
+          </w:p>
+        </w:tc>
+        <w:tc>
+          <w:tcPr>
+            <w:tcW w:type="dxa" w:w="2520"/>
+            <w:vAlign w:val="center"/>
+            <w:shd w:fill="F2F6F7"/>
+            <w:tcBorders>
+              <w:top w:val="single" w:sz="4" w:color="D9D9D9"/>
+              <w:left w:val="single" w:sz="4" w:color="D9D9D9"/>
+              <w:bottom w:val="single" w:sz="4" w:color="D9D9D9"/>
+              <w:right w:val="single" w:sz="4" w:color="D9D9D9"/>
+            </w:tcBorders>
+            <w:tcMar>
+              <w:top w:w="80" w:type="dxa"/>
+              <w:left w:w="80" w:type="dxa"/>
+              <w:bottom w:w="80" w:type="dxa"/>
+              <w:right w:w="80" w:type="dxa"/>
+            </w:tcMar>
+          </w:tcPr>
+          <w:p>
+            <w:pPr>
+              <w:spacing w:after="80" w:before="80" w:line="252" w:lineRule="auto"/>
+            </w:pPr>
+            <w:r>
+              <w:rPr>
+                <w:b w:val="0"/>
+                <w:color w:val="202830"/>
+                <w:sz w:val="19"/>
+              </w:rPr>
+              <w:t>Synthetic only</w:t>
+            </w:r>
+          </w:p>
+        </w:tc>
+      </w:tr>
+      <w:tr>
+        <w:trPr>
+          <w:cantSplit/>
+        </w:trPr>
+        <w:tc>
+          <w:tcPr>
+            <w:tcW w:type="dxa" w:w="2304"/>
+            <w:vAlign w:val="center"/>
+            <w:shd w:fill="FFFFFF"/>
+            <w:tcBorders>
+              <w:top w:val="single" w:sz="4" w:color="D9D9D9"/>
+              <w:left w:val="single" w:sz="4" w:color="D9D9D9"/>
+              <w:bottom w:val="single" w:sz="4" w:color="D9D9D9"/>
+              <w:right w:val="single" w:sz="4" w:color="D9D9D9"/>
+            </w:tcBorders>
+            <w:tcMar>
+              <w:top w:w="80" w:type="dxa"/>
+              <w:left w:w="80" w:type="dxa"/>
+              <w:bottom w:w="80" w:type="dxa"/>
+              <w:right w:w="80" w:type="dxa"/>
+            </w:tcMar>
+          </w:tcPr>
+          <w:p>
+            <w:pPr>
+              <w:spacing w:after="80" w:before="80" w:line="252" w:lineRule="auto"/>
+            </w:pPr>
+            <w:r>
+              <w:rPr>
+                <w:b w:val="0"/>
+                <w:color w:val="202830"/>
+                <w:sz w:val="19"/>
+              </w:rPr>
+              <w:t>mBERT fr-en</w:t>
+            </w:r>
+          </w:p>
+        </w:tc>
+        <w:tc>
+          <w:tcPr>
+            <w:tcW w:type="dxa" w:w="2232"/>
+            <w:vAlign w:val="center"/>
+            <w:shd w:fill="FFFFFF"/>
+            <w:tcBorders>
+              <w:top w:val="single" w:sz="4" w:color="D9D9D9"/>
+              <w:left w:val="single" w:sz="4" w:color="D9D9D9"/>
+              <w:bottom w:val="single" w:sz="4" w:color="D9D9D9"/>
+              <w:right w:val="single" w:sz="4" w:color="D9D9D9"/>
+            </w:tcBorders>
+            <w:tcMar>
+              <w:top w:w="80" w:type="dxa"/>
+              <w:left w:w="80" w:type="dxa"/>
+              <w:bottom w:w="80" w:type="dxa"/>
+              <w:right w:w="80" w:type="dxa"/>
+            </w:tcMar>
+          </w:tcPr>
+          <w:p>
+            <w:pPr>
+              <w:spacing w:after="80" w:before="80" w:line="252" w:lineRule="auto"/>
+            </w:pPr>
+            <w:r>
+              <w:rPr>
+                <w:b w:val="0"/>
+                <w:color w:val="202830"/>
+                <w:sz w:val="19"/>
+              </w:rPr>
+              <w:t>1,000 generated</w:t>
+            </w:r>
+          </w:p>
+        </w:tc>
+        <w:tc>
+          <w:tcPr>
+            <w:tcW w:type="dxa" w:w="2952"/>
+            <w:vAlign w:val="center"/>
+            <w:shd w:fill="FFFFFF"/>
+            <w:tcBorders>
+              <w:top w:val="single" w:sz="4" w:color="D9D9D9"/>
+              <w:left w:val="single" w:sz="4" w:color="D9D9D9"/>
+              <w:bottom w:val="single" w:sz="4" w:color="D9D9D9"/>
+              <w:right w:val="single" w:sz="4" w:color="D9D9D9"/>
+            </w:tcBorders>
+            <w:tcMar>
+              <w:top w:w="80" w:type="dxa"/>
+              <w:left w:w="80" w:type="dxa"/>
+              <w:bottom w:w="80" w:type="dxa"/>
+              <w:right w:w="80" w:type="dxa"/>
+            </w:tcMar>
+          </w:tcPr>
+          <w:p>
+            <w:pPr>
+              <w:spacing w:after="80" w:before="80" w:line="252" w:lineRule="auto"/>
+            </w:pPr>
+            <w:r>
+              <w:rPr>
+                <w:b w:val="0"/>
+                <w:color w:val="202830"/>
+                <w:sz w:val="19"/>
+              </w:rPr>
+              <w:t>78.5%; macro-F1 0.7708</w:t>
+            </w:r>
+          </w:p>
+        </w:tc>
+        <w:tc>
+          <w:tcPr>
+            <w:tcW w:type="dxa" w:w="2520"/>
+            <w:vAlign w:val="center"/>
+            <w:shd w:fill="FFFFFF"/>
+            <w:tcBorders>
+              <w:top w:val="single" w:sz="4" w:color="D9D9D9"/>
+              <w:left w:val="single" w:sz="4" w:color="D9D9D9"/>
+              <w:bottom w:val="single" w:sz="4" w:color="D9D9D9"/>
+              <w:right w:val="single" w:sz="4" w:color="D9D9D9"/>
+            </w:tcBorders>
+            <w:tcMar>
+              <w:top w:w="80" w:type="dxa"/>
+              <w:left w:w="80" w:type="dxa"/>
+              <w:bottom w:w="80" w:type="dxa"/>
+              <w:right w:w="80" w:type="dxa"/>
+            </w:tcMar>
+          </w:tcPr>
+          <w:p>
+            <w:pPr>
+              <w:spacing w:after="80" w:before="80" w:line="252" w:lineRule="auto"/>
+            </w:pPr>
+            <w:r>
+              <w:rPr>
+                <w:b w:val="0"/>
+                <w:color w:val="202830"/>
+                <w:sz w:val="19"/>
+              </w:rPr>
+              <w:t>Synthetic only</w:t>
             </w:r>
           </w:p>
         </w:tc>
@@ -3225,7 +3491,7 @@
     </w:p>
     <w:p>
       <w:r>
-        <w:t>Complete mBERT only under the same protocol as its comparator. Match MuRIL/XLM-R on identical partitions, preprocessing and budget. Expand language scope after human review. Analyze negation, spellings, emoji, sarcasm, length and code-mix ratio.</w:t>
+        <w:t>Repeat the matched mBERT and XLM-R experiments with additional seeds and reviewed data. Match MuRIL/XLM-R on identical partitions, preprocessing and budget. Expand language scope after human review. Analyze negation, spellings, emoji, sarcasm, length and code-mix ratio.</w:t>
       </w:r>
     </w:p>
     <w:p>
@@ -3273,7 +3539,7 @@
     </w:p>
     <w:p>
       <w:r>
-        <w:t>Saved XLM-R/MuRIL scores demonstrate generated-data experiments, not accuracy on natural messages. Original sentiment metrics are context, not a seven-emotion baseline. Emoji2Vec fusion, trained sarcasm, calibration, Qwen benefit and mBERT training are not claimed. The defensible next step is human-reviewed data and matched frozen-split experiments with error analysis.</w:t>
+        <w:t>Saved XLM-R, MuRIL and mBERT scores demonstrate generated-data experiments, not accuracy on natural messages. Original sentiment metrics are context, not a seven-emotion baseline. Emoji2Vec fusion, trained sarcasm, calibrated confidence and measured Qwen benefit are not claimed. The defensible next step is human-reviewed data and matched frozen-split experiments with error analysis.</w:t>
       </w:r>
     </w:p>
     <w:p>
@@ -3348,7 +3614,12 @@
     </w:p>
     <w:p>
       <w:r>
-        <w:t>On 22 October 2026, the complete offline suite passed 163 tests and 33 subtests. Coverage includes routing, seven-label schemas, file mapping invalidation, dataset validation, checkpoint installation, review failures, sequential disagreement inference, session correction export and Colab packaging. The mBERT handoff also passed isolated imports using only its exported source tree. A live Streamlit test loaded the installed XLM-R and MuRIL weights sequentially and produced seven scores for each phrase without writing a review queue. Both predicted joy for Aaj main bahut khush hoon; both incorrectly predicted sadness for the fear phrase Mujhe bahut darr lag raha hai. This example shows why agreement is not correctness. Ollama was initially stopped. After starting it, a live Qwen3 0.6B call returned a valid structured review in 10.56 seconds using a lexical-demo primary prediction. It suggested neutral for the fear phrase, which was not a quality improvement. The call verifies connectivity and response validation, not reviewer accuracy; failure and unavailable states are also tested. No model was trained locally in this update.</w:t>
+        <w:t>On 22 October 2026, the complete offline suite passed 173 tests and 33 subtests. Coverage includes routing, seven-label schemas, file mapping invalidation, dataset validation, checkpoint installation, review failures, sequential disagreement inference, session correction export and Colab packaging. The mBERT handoff also passed isolated imports using only its exported source tree. A live Streamlit test loaded the installed XLM-R and MuRIL weights sequentially and produced seven scores for each phrase without writing a review queue. Both predicted joy for Aaj main bahut khush hoon; both incorrectly predicted sadness for the fear phrase Mujhe bahut darr lag raha hai. This example shows why agreement is not correctness. Ollama was initially stopped. After starting it, a live Qwen3 0.6B call returned a valid structured review in 10.56 seconds using a lexical-demo primary prediction. It suggested neutral for the fear phrase, which was not a quality improvement. The call verifies connectivity and response validation, not reviewer accuracy; failure and unavailable states are also tested. No model was trained locally in this update.</w:t>
+      </w:r>
+    </w:p>
+    <w:p>
+      <w:r>
+        <w:t>The newly installed mBERT model was tested in Emotion lab for both language mixes. All 2,000 held-out phrases reproduced the exported accuracy and macro-F1, with zero recorded training/validation overlap. The happy phrase Aaj main bahut khush hoon was nevertheless classified as sadness with score 0.9994. Successful export and matching synthetic scores verify deployment consistency; they do not establish natural-language reliability.</w:t>
       </w:r>
     </w:p>
     <w:sectPr>

</xml_diff>